<commit_message>
feat(contrat): page remplissable + marque GILD-TECH + setup par palier
- Marque GILD-TECH (retrait "Immo") partout, entité Girlden LTD CRN 14837617
- Formulaire remplissable -> aperçu live -> PDF pré-rempli (print)
- Setup par palier aligné site : RESPOND £490 / CONVERT £990 / DOMINATE £1490
- Suppression des 2 PDF modèles vierges (orphelins, page génère le PDF)

Co-Authored-By: Claude Opus 4.8 <noreply@anthropic.com>
</commit_message>
<xml_diff>
--- a/contrat/CONTRAT-SERVICE-GILD-TECH-TEMPLATE-FR.docx
+++ b/contrat/CONTRAT-SERVICE-GILD-TECH-TEMPLATE-FR.docx
@@ -122,7 +122,7 @@
           <w:sz w:val="21"/>
           <w:szCs w:val="21"/>
         </w:rPr>
-        <w:t xml:space="preserve">Exerçant sous la marque GILD-TECH Immo. Ci-après « le Prestataire ».</w:t>
+        <w:t xml:space="preserve">Exerçant sous la marque GILD-TECH. Ci-après « le Prestataire ».</w:t>
       </w:r>
     </w:p>
     <w:p>
@@ -992,7 +992,7 @@
                 <w:sz w:val="20"/>
                 <w:szCs w:val="20"/>
               </w:rPr>
-              <w:t xml:space="preserve">Setup</w:t>
+              <w:t xml:space="preserve">Mise en service</w:t>
             </w:r>
           </w:p>
         </w:tc>
@@ -1075,7 +1075,7 @@
                 <w:sz w:val="20"/>
                 <w:szCs w:val="20"/>
               </w:rPr>
-              <w:t xml:space="preserve">£990</w:t>
+              <w:t xml:space="preserve">£490</w:t>
             </w:r>
           </w:p>
         </w:tc>
@@ -1241,7 +1241,7 @@
                 <w:sz w:val="20"/>
                 <w:szCs w:val="20"/>
               </w:rPr>
-              <w:t xml:space="preserve">£990</w:t>
+              <w:t xml:space="preserve">£1 490</w:t>
             </w:r>
           </w:p>
         </w:tc>
@@ -2263,7 +2263,7 @@
                 <w:sz w:val="20"/>
                 <w:szCs w:val="20"/>
               </w:rPr>
-              <w:t xml:space="preserve">Pour Girlden LTD (GILD-TECH Immo)</w:t>
+              <w:t xml:space="preserve">Pour Girlden LTD (GILD-TECH)</w:t>
             </w:r>
           </w:p>
           <w:p>
@@ -2541,7 +2541,7 @@
         <w:sz w:val="15"/>
         <w:szCs w:val="15"/>
       </w:rPr>
-      <w:t xml:space="preserve">Girlden LTD — Contrat de service GILD-TECH Immo — </w:t>
+      <w:t xml:space="preserve">Girlden LTD — Contrat de service GILD-TECH — </w:t>
     </w:r>
     <w:r>
       <w:rPr>
@@ -2642,17 +2642,6 @@
         <w:szCs w:val="30"/>
       </w:rPr>
       <w:t xml:space="preserve">GILD-TECH</w:t>
-    </w:r>
-    <w:r>
-      <w:rPr>
-        <w:rFonts w:ascii="Calibri" w:cs="Calibri" w:eastAsia="Calibri" w:hAnsi="Calibri"/>
-        <w:b/>
-        <w:bCs/>
-        <w:color w:val="0B1D33"/>
-        <w:sz w:val="30"/>
-        <w:szCs w:val="30"/>
-      </w:rPr>
-      <w:t xml:space="preserve"> Immo</w:t>
     </w:r>
   </w:p>
   <w:p>

</xml_diff>

<commit_message>
CGV, Terms et contrat alignés : frais de mise en service maintenus, offre annuelle, quotas, frais Meta inclus (ORDRE 103, à relire par le COO)
CGV et Terms : frais de mise en service par offre (490, 990, 1 490 £) payables à la commande,
offre annuelle (12 mois au prix de 10, mise en service offerte, sans reconduction tacite : 2 900,
4 900, 7 900 £), quotas 100/200/400 acheteurs et 1 £ au-delà, frais Meta inclus, date de mise en
service convenue à la signature. Retrait de « aucun frais d'installation » et « pas d'offre one-off ».

Contrat (page et modèles Word FR/EN) aligné sur les CGV : garantie premier mois, plafond 12 mois,
confidentialité 3 ans, délai « date convenue à la signature » (3 à 5 jours retiré). Correctif : la
ligne « Offre retenue » perdait l'abonnement et la mise en service (balises span non fermées depuis
e3a53d5). Montant anglais au format £1,490. Tirets longs et points médians retirés des modèles Word.

Co-Authored-By: Claude Opus 5.5 <noreply@anthropic.com>
</commit_message>
<xml_diff>
--- a/contrat/CONTRAT-SERVICE-GILD-TECH-TEMPLATE-FR.docx
+++ b/contrat/CONTRAT-SERVICE-GILD-TECH-TEMPLATE-FR.docx
@@ -31,7 +31,7 @@
           <w:sz w:val="22"/>
           <w:szCs w:val="22"/>
         </w:rPr>
-        <w:t xml:space="preserve">Assistant IA « Sarah » — qualification et suivi de contacts entrants</w:t>
+        <w:t xml:space="preserve">Assistant IA « Sarah » : qualification et suivi de contacts entrants</w:t>
       </w:r>
     </w:p>
     <w:p>
@@ -108,7 +108,7 @@
           <w:sz w:val="21"/>
           <w:szCs w:val="21"/>
         </w:rPr>
-        <w:t xml:space="preserve">Siège social : 71–75 Shelton Street, Covent Garden, London, WC2H 9JQ, Royaume-Uni.</w:t>
+        <w:t xml:space="preserve">Siège social : 71-75 Shelton Street, Covent Garden, London, WC2H 9JQ, Royaume-Uni.</w:t>
       </w:r>
     </w:p>
     <w:p>
@@ -273,7 +273,7 @@
           <w:sz w:val="21"/>
           <w:szCs w:val="21"/>
         </w:rPr>
-        <w:t xml:space="preserve">[Email]  ·  [Téléphone]</w:t>
+        <w:t xml:space="preserve">[Email]  /  [Téléphone]</w:t>
       </w:r>
     </w:p>
     <w:p>
@@ -378,7 +378,7 @@
           <w:sz w:val="19"/>
           <w:szCs w:val="19"/>
         </w:rPr>
-        <w:t xml:space="preserve">RESPOND (palier Capter) · CONVERT (palier Convertir) · DOMINATE (palier Développer, périmètre défini en annexe). Le périmètre de l’offre retenue est décrit à l’article 2.</w:t>
+        <w:t xml:space="preserve">RESPOND (palier Capter), CONVERT (palier Convertir), DOMINATE (palier Développer, périmètre défini en annexe). Le périmètre de l’offre retenue est décrit à l’article 2.</w:t>
       </w:r>
     </w:p>
     <w:p>
@@ -425,7 +425,7 @@
           <w:sz w:val="21"/>
           <w:szCs w:val="21"/>
         </w:rPr>
-        <w:t xml:space="preserve">2.1  RESPOND — inclus et actif dès la mise en service</w:t>
+        <w:t xml:space="preserve">2.1  RESPOND : inclus et actif dès la mise en service</w:t>
       </w:r>
     </w:p>
     <w:p>
@@ -463,7 +463,7 @@
           <w:sz w:val="21"/>
           <w:szCs w:val="21"/>
         </w:rPr>
-        <w:t xml:space="preserve">Conversation de qualification en langage naturel, en français, anglais, néerlandais et russe (le thaï est disponible en écrit ; la voix n’est pas incluse — voir 2.4).</w:t>
+        <w:t xml:space="preserve">Conversation de qualification en langage naturel, en français, anglais, néerlandais et russe (le thaï est disponible en écrit ; la voix n’est pas incluse, voir 2.4).</w:t>
       </w:r>
     </w:p>
     <w:p>
@@ -574,7 +574,7 @@
           <w:sz w:val="21"/>
           <w:szCs w:val="21"/>
         </w:rPr>
-        <w:t xml:space="preserve">2.2  CONVERT — inclus en complément de RESPOND</w:t>
+        <w:t xml:space="preserve">2.2  CONVERT : inclus en complément de RESPOND</w:t>
       </w:r>
     </w:p>
     <w:p>
@@ -786,26 +786,26 @@
           <w:sz w:val="21"/>
           <w:szCs w:val="21"/>
         </w:rPr>
-        <w:t xml:space="preserve">Sarah vocale (réponse aux messages vocaux et appels) — en cours de mise au point, non garantie, non incluse.</w:t>
-      </w:r>
-    </w:p>
-    <w:p>
-      <w:pPr>
-        <w:pStyle w:val="ListParagraph"/>
-        <w:numPr>
-          <w:ilvl w:val="0"/>
-          <w:numId w:val="2"/>
-        </w:numPr>
-        <w:spacing w:after="88" w:line="264"/>
-      </w:pPr>
-      <w:r>
-        <w:rPr>
-          <w:rFonts w:ascii="Calibri" w:cs="Calibri" w:eastAsia="Calibri" w:hAnsi="Calibri"/>
-          <w:color w:val="0A0A0A"/>
-          <w:sz w:val="21"/>
-          <w:szCs w:val="21"/>
-        </w:rPr>
-        <w:t xml:space="preserve">Réponse automatique aux commentaires Facebook / Instagram (comment-to-DM) — évolution future, non disponible.</w:t>
+        <w:t xml:space="preserve">Sarah vocale (réponse aux messages vocaux et appels) : en cours de mise au point, non garantie, non incluse.</w:t>
+      </w:r>
+    </w:p>
+    <w:p>
+      <w:pPr>
+        <w:pStyle w:val="ListParagraph"/>
+        <w:numPr>
+          <w:ilvl w:val="0"/>
+          <w:numId w:val="2"/>
+        </w:numPr>
+        <w:spacing w:after="88" w:line="264"/>
+      </w:pPr>
+      <w:r>
+        <w:rPr>
+          <w:rFonts w:ascii="Calibri" w:cs="Calibri" w:eastAsia="Calibri" w:hAnsi="Calibri"/>
+          <w:color w:val="0A0A0A"/>
+          <w:sz w:val="21"/>
+          <w:szCs w:val="21"/>
+        </w:rPr>
+        <w:t xml:space="preserve">Réponse automatique aux commentaires Facebook / Instagram (comment-to-DM) : évolution future, non disponible.</w:t>
       </w:r>
     </w:p>
     <w:p>
@@ -1370,11 +1370,86 @@
       <w:r>
         <w:rPr>
           <w:rFonts w:ascii="Calibri" w:cs="Calibri" w:eastAsia="Calibri" w:hAnsi="Calibri"/>
-          <w:color w:val="0A0A0A"/>
-          <w:sz w:val="21"/>
-          <w:szCs w:val="21"/>
-        </w:rPr>
-        <w:t xml:space="preserve">L’abonnement est payable mensuellement et d’avance. Les frais de mise en service sont dus avant le démarrage de la configuration.</w:t>
+          <w:b/>
+          <w:bCs/>
+          <w:color w:val="0A0A0A"/>
+          <w:sz w:val="21"/>
+          <w:szCs w:val="21"/>
+        </w:rPr>
+        <w:t xml:space="preserve">Formule de paiement : </w:t>
+      </w:r>
+      <w:r>
+        <w:rPr>
+          <w:rFonts w:ascii="Calibri" w:cs="Calibri" w:eastAsia="Calibri" w:hAnsi="Calibri"/>
+          <w:color w:val="0A0A0A"/>
+          <w:sz w:val="21"/>
+          <w:szCs w:val="21"/>
+        </w:rPr>
+        <w:t xml:space="preserve">mensuelle ☐     annuelle ☐</w:t>
+      </w:r>
+    </w:p>
+    <w:p>
+      <w:pPr>
+        <w:spacing w:after="120" w:line="264"/>
+      </w:pPr>
+      <w:r>
+        <w:rPr>
+          <w:rFonts w:ascii="Calibri" w:cs="Calibri" w:eastAsia="Calibri" w:hAnsi="Calibri"/>
+          <w:b/>
+          <w:bCs/>
+          <w:color w:val="0A0A0A"/>
+          <w:sz w:val="21"/>
+          <w:szCs w:val="21"/>
+        </w:rPr>
+        <w:t xml:space="preserve">Offre annuelle : </w:t>
+      </w:r>
+      <w:r>
+        <w:rPr>
+          <w:rFonts w:ascii="Calibri" w:cs="Calibri" w:eastAsia="Calibri" w:hAnsi="Calibri"/>
+          <w:color w:val="0A0A0A"/>
+          <w:sz w:val="21"/>
+          <w:szCs w:val="21"/>
+        </w:rPr>
+        <w:t xml:space="preserve">douze mois d’abonnement payés en une fois, à la commande, au prix de dix mois, mise en service offerte, sans reconduction tacite. RESPOND £2 900, CONVERT £4 900, DOMINATE £7 900.</w:t>
+      </w:r>
+    </w:p>
+    <w:p>
+      <w:pPr>
+        <w:spacing w:after="120" w:line="264"/>
+      </w:pPr>
+      <w:r>
+        <w:rPr>
+          <w:rFonts w:ascii="Calibri" w:cs="Calibri" w:eastAsia="Calibri" w:hAnsi="Calibri"/>
+          <w:b/>
+          <w:bCs/>
+          <w:color w:val="0A0A0A"/>
+          <w:sz w:val="21"/>
+          <w:szCs w:val="21"/>
+        </w:rPr>
+        <w:t xml:space="preserve">Volume inclus : </w:t>
+      </w:r>
+      <w:r>
+        <w:rPr>
+          <w:rFonts w:ascii="Calibri" w:cs="Calibri" w:eastAsia="Calibri" w:hAnsi="Calibri"/>
+          <w:color w:val="0A0A0A"/>
+          <w:sz w:val="21"/>
+          <w:szCs w:val="21"/>
+        </w:rPr>
+        <w:t xml:space="preserve">jusqu’à 100 acheteurs par mois avec RESPOND, 200 avec CONVERT, 400 avec DOMINATE. Au-delà : £1 par acheteur supplémentaire. Un acheteur est une personne qui a écrit à Sarah dans le mois. Les frais facturés par Meta pour les messages WhatsApp sont inclus dans l’abonnement.</w:t>
+      </w:r>
+    </w:p>
+    <w:p>
+      <w:pPr>
+        <w:spacing w:after="120" w:line="264"/>
+      </w:pPr>
+      <w:r>
+        <w:rPr>
+          <w:rFonts w:ascii="Calibri" w:cs="Calibri" w:eastAsia="Calibri" w:hAnsi="Calibri"/>
+          <w:color w:val="0A0A0A"/>
+          <w:sz w:val="21"/>
+          <w:szCs w:val="21"/>
+        </w:rPr>
+        <w:t xml:space="preserve">Les frais de mise en service sont payables à la commande. L’abonnement mensuel est payable mensuellement et d’avance ; l’offre annuelle, en une fois à la commande.</w:t>
       </w:r>
     </w:p>
     <w:p>
@@ -1410,7 +1485,7 @@
           <w:sz w:val="21"/>
           <w:szCs w:val="21"/>
         </w:rPr>
-        <w:t xml:space="preserve">Le contrat prend effet à sa signature et est conclu au mois, sans engagement de durée minimale.</w:t>
+        <w:t xml:space="preserve">Le contrat prend effet à sa signature. En formule mensuelle, il est conclu au mois, sans engagement de durée minimale.</w:t>
       </w:r>
     </w:p>
     <w:p>
@@ -1463,6 +1538,25 @@
       <w:r>
         <w:rPr>
           <w:rFonts w:ascii="Calibri" w:cs="Calibri" w:eastAsia="Calibri" w:hAnsi="Calibri"/>
+          <w:color w:val="0A0A0A"/>
+          <w:sz w:val="21"/>
+          <w:szCs w:val="21"/>
+        </w:rPr>
+        <w:t xml:space="preserve">En formule annuelle, le contrat couvre douze mois d’abonnement et prend fin à leur terme, sans reconduction tacite.</w:t>
+      </w:r>
+    </w:p>
+    <w:p>
+      <w:pPr>
+        <w:pStyle w:val="ListParagraph"/>
+        <w:numPr>
+          <w:ilvl w:val="0"/>
+          <w:numId w:val="2"/>
+        </w:numPr>
+        <w:spacing w:after="88" w:line="264"/>
+      </w:pPr>
+      <w:r>
+        <w:rPr>
+          <w:rFonts w:ascii="Calibri" w:cs="Calibri" w:eastAsia="Calibri" w:hAnsi="Calibri"/>
           <w:b/>
           <w:bCs/>
           <w:color w:val="0A0A0A"/>
@@ -1478,7 +1572,7 @@
           <w:sz w:val="21"/>
           <w:szCs w:val="21"/>
         </w:rPr>
-        <w:t xml:space="preserve">si le Client n’est pas satisfait durant les 30 premiers jours suivant la mise en service, il obtient sur simple demande le remboursement intégral des sommes versées (abonnement et setup), sans justification.</w:t>
+        <w:t xml:space="preserve">le Client peut demander le remboursement intégral de son premier mois d’abonnement dans les 30 jours suivant la mise en service, sans avoir à se justifier. Cette garantie n’est soumise à aucune condition de résultat, de performance ou de chiffre commercial.</w:t>
       </w:r>
     </w:p>
     <w:p>
@@ -1511,7 +1605,7 @@
           <w:sz w:val="21"/>
           <w:szCs w:val="21"/>
         </w:rPr>
-        <w:t xml:space="preserve">Date de mise en service prévue : </w:t>
+        <w:t xml:space="preserve">Date de mise en service convenue à la signature : </w:t>
       </w:r>
       <w:r>
         <w:rPr>
@@ -1541,45 +1635,26 @@
           <w:sz w:val="21"/>
           <w:szCs w:val="21"/>
         </w:rPr>
-        <w:t xml:space="preserve">La configuration démarre à réception des accès nécessaires et du paiement des frais de mise en service.</w:t>
-      </w:r>
-    </w:p>
-    <w:p>
-      <w:pPr>
-        <w:pStyle w:val="ListParagraph"/>
-        <w:numPr>
-          <w:ilvl w:val="0"/>
-          <w:numId w:val="2"/>
-        </w:numPr>
-        <w:spacing w:after="88" w:line="264"/>
-      </w:pPr>
-      <w:r>
-        <w:rPr>
-          <w:rFonts w:ascii="Calibri" w:cs="Calibri" w:eastAsia="Calibri" w:hAnsi="Calibri"/>
-          <w:color w:val="0A0A0A"/>
-          <w:sz w:val="21"/>
-          <w:szCs w:val="21"/>
-        </w:rPr>
-        <w:t xml:space="preserve">Délai indicatif : 3 à 5 jours ouvrés pour la configuration complète (canal WhatsApp, lien de rendez-vous, CRM, zones et affectations, calibrage des messages).</w:t>
-      </w:r>
-    </w:p>
-    <w:p>
-      <w:pPr>
-        <w:pStyle w:val="ListParagraph"/>
-        <w:numPr>
-          <w:ilvl w:val="0"/>
-          <w:numId w:val="2"/>
-        </w:numPr>
-        <w:spacing w:after="88" w:line="264"/>
-      </w:pPr>
-      <w:r>
-        <w:rPr>
-          <w:rFonts w:ascii="Calibri" w:cs="Calibri" w:eastAsia="Calibri" w:hAnsi="Calibri"/>
-          <w:color w:val="0A0A0A"/>
-          <w:sz w:val="21"/>
-          <w:szCs w:val="21"/>
-        </w:rPr>
-        <w:t xml:space="preserve">Ce délai dépend de la fourniture par le Client des éléments demandés. Le Prestataire ne promet aucune mise en service immédiate.</w:t>
+        <w:t xml:space="preserve">La configuration (canal WhatsApp, lien de rendez-vous, CRM, zones et affectations, calibrage des messages) démarre à réception des accès nécessaires et du paiement prévu à l’article 3.</w:t>
+      </w:r>
+    </w:p>
+    <w:p>
+      <w:pPr>
+        <w:pStyle w:val="ListParagraph"/>
+        <w:numPr>
+          <w:ilvl w:val="0"/>
+          <w:numId w:val="2"/>
+        </w:numPr>
+        <w:spacing w:after="88" w:line="264"/>
+      </w:pPr>
+      <w:r>
+        <w:rPr>
+          <w:rFonts w:ascii="Calibri" w:cs="Calibri" w:eastAsia="Calibri" w:hAnsi="Calibri"/>
+          <w:color w:val="0A0A0A"/>
+          <w:sz w:val="21"/>
+          <w:szCs w:val="21"/>
+        </w:rPr>
+        <w:t xml:space="preserve">La date de mise en service est convenue à la signature et indiquée ci-dessus. Elle suppose que le Client fournisse les éléments demandés ; le Prestataire s’engage à agir avec diligence dès leur réception et ne promet aucune mise en service immédiate.</w:t>
       </w:r>
     </w:p>
     <w:p>
@@ -1746,7 +1821,7 @@
           <w:sz w:val="21"/>
           <w:szCs w:val="21"/>
         </w:rPr>
-        <w:t xml:space="preserve">la responsabilité totale du Prestataire, tous préjudices confondus, est plafonnée au montant des sommes effectivement payées par le Client au cours des trois (3) derniers mois. Le Prestataire n’est en aucun cas responsable des dommages indirects (perte de chiffre d’affaires, de clientèle, de données, d’image).</w:t>
+        <w:t xml:space="preserve">la responsabilité totale du Prestataire, tous préjudices confondus, est plafonnée au montant effectivement payé par le Client au titre des douze (12) derniers mois d’abonnement. Le Prestataire n’est en aucun cas responsable des dommages indirects (perte de chiffre d’affaires, de clientèle, de données, d’image).</w:t>
       </w:r>
     </w:p>
     <w:p>
@@ -1944,7 +2019,7 @@
           <w:sz w:val="21"/>
           <w:szCs w:val="21"/>
         </w:rPr>
-        <w:t xml:space="preserve">Chaque Partie s’engage à garder strictement confidentielles les informations non publiques de l’autre (données commerciales, contacts, méthodes, tarifs) et à ne les utiliser que pour l’exécution du présent contrat. Cet engagement survit deux (2) ans après la fin du contrat.</w:t>
+        <w:t xml:space="preserve">Chaque Partie s’engage à garder strictement confidentielles les informations non publiques de l’autre (données commerciales, contacts, méthodes, tarifs) et à ne les utiliser que pour l’exécution du présent contrat. Cet engagement vaut pendant toute la durée du contrat et pendant trois (3) ans après sa fin.</w:t>
       </w:r>
     </w:p>
     <w:p>
@@ -1980,7 +2055,7 @@
           <w:sz w:val="21"/>
           <w:szCs w:val="21"/>
         </w:rPr>
-        <w:t xml:space="preserve">Paiement par Stripe, en GBP, par prélèvement mensuel d’avance.</w:t>
+        <w:t xml:space="preserve">Paiement par Stripe ou tout autre moyen convenu à la signature, en GBP : frais de mise en service à la commande, puis abonnement prélevé chaque mois d’avance ; offre annuelle en une fois, à la commande.</w:t>
       </w:r>
     </w:p>
     <w:p>
@@ -2029,7 +2104,7 @@
           <w:sz w:val="21"/>
           <w:szCs w:val="21"/>
         </w:rPr>
-        <w:t xml:space="preserve">Les frais de mise en service ne sont pas remboursables, sous réserve de la garantie 30 jours (article 4).</w:t>
+        <w:t xml:space="preserve">Les frais de mise en service ne sont pas remboursables. La garantie 30 jours (article 4) porte sur le premier mois d’abonnement.</w:t>
       </w:r>
     </w:p>
     <w:p>
@@ -2541,7 +2616,7 @@
         <w:sz w:val="15"/>
         <w:szCs w:val="15"/>
       </w:rPr>
-      <w:t xml:space="preserve">Girlden LTD — Contrat de service GILD-TECH — </w:t>
+      <w:t xml:space="preserve">Girlden LTD, Contrat de service GILD-TECH, </w:t>
     </w:r>
     <w:r>
       <w:rPr>
@@ -2658,7 +2733,7 @@
         <w:sz w:val="15"/>
         <w:szCs w:val="15"/>
       </w:rPr>
-      <w:t xml:space="preserve">Girlden LTD  ·  CRN 14837617  ·  71–75 Shelton Street, Covent Garden, London WC2H 9JQ</w:t>
+      <w:t xml:space="preserve">Girlden LTD, CRN 14837617, 71-75 Shelton Street, Covent Garden, London WC2H 9JQ</w:t>
     </w:r>
   </w:p>
 </w:hdr>

</xml_diff>